<commit_message>
fix: sync resume stats with canonical CAST data and regenerate PDF
Synced portfolio stats to reflect CAST v7.3 → v7.4.1 milestone:
- BATS test count: 1,325 → 1,185 (both static references)
- Package ecosystem: 16 packages → 13 taps + umbrella formula
- Vite version: 6 → 8

Updated resume contact header with edwardkubiak.com domain and LinkedIn.
PDF regenerated via npm run build-resume.

Co-Authored-By: Claude <noreply@anthropic.com>
</commit_message>
<xml_diff>
--- a/assets/resume/Edward_Kubiak_Resume.docx
+++ b/assets/resume/Edward_Kubiak_Resume.docx
@@ -64,6 +64,14 @@
           <w:t xml:space="preserve">github.com/ek33450505</w:t>
         </w:r>
       </w:hyperlink>
+      <w:r>
+        <w:rPr>
+          <w:color w:val="555555"/>
+          <w:sz w:val="18"/>
+          <w:szCs w:val="18"/>
+        </w:rPr>
+        <w:t xml:space="preserve">  •  edwardkubiak.com  •  linkedin.com/in/edward-kubiak</w:t>
+      </w:r>
     </w:p>
     <w:p>
       <w:pPr>
@@ -78,7 +86,7 @@
         <w:spacing w:after="80"/>
       </w:pPr>
       <w:r>
-        <w:t xml:space="preserve">Developer-tooling engineer and daily Claude Code power user who builds — and writes about — multi-agent systems on Claude. Creator and maintainer of CAST, an open-source, local-first 23-agent framework for Claude Code with hook-driven dispatch, model-aware routing, and SQLite observability, distributed as 16 Homebrew packages. Ships and maintains production web applications serving 4,200+ users across 900+ Ohio school districts. Equally comfortable deep in agent-orchestration internals and explaining them clearly to other developers.</w:t>
+        <w:t xml:space="preserve">Developer-tooling engineer and daily Claude Code power user who builds — and writes about — multi-agent systems on Claude. Creator and maintainer of CAST, an open-source, local-first 23-agent framework for Claude Code with hook-driven dispatch, model-aware routing, and SQLite observability, distributed as 13 Homebrew taps plus the umbrella cast formula. Ships and maintains production web applications serving 4,200+ users across 900+ Ohio school districts. Equally comfortable deep in agent-orchestration internals and explaining them clearly to other developers.</w:t>
       </w:r>
     </w:p>
     <w:p>
@@ -126,7 +134,7 @@
         <w:t xml:space="preserve">Languages &amp; frameworks: </w:t>
       </w:r>
       <w:r>
-        <w:t xml:space="preserve">TypeScript, Python, Rust, Bash, Node.js, React 19, Express 5, Vite 6, Tauri v2, Flask, Textual</w:t>
+        <w:t xml:space="preserve">TypeScript, Python, Rust, Bash, Node.js, React 19, Express 5, Vite 8, Tauri v2, Flask, Textual</w:t>
       </w:r>
     </w:p>
     <w:p>
@@ -186,7 +194,7 @@
         <w:t xml:space="preserve">Testing: </w:t>
       </w:r>
       <w:r>
-        <w:t xml:space="preserve">Vitest, BATS (1,325 shell tests), Playwright, Supertest, React Testing Library</w:t>
+        <w:t xml:space="preserve">Vitest, BATS (1,185 shell tests), Playwright, Supertest, React Testing Library</w:t>
       </w:r>
     </w:p>
     <w:p>
@@ -249,27 +257,27 @@
           <w:b/>
           <w:bCs/>
         </w:rPr>
-        <w:t xml:space="preserve">CAST (Claude Agent Specialist Team) v7.3 — </w:t>
-      </w:r>
-      <w:r>
-        <w:t xml:space="preserve">Designed and maintain a local-first, open-source multi-agent framework for Claude Code: 23 specialist agents, hook-driven dispatch, model-aware routing (Sonnet for complex work, Haiku for lightweight/review), per-agent persistent memory with FTS5 search, and local SQLite observability. 19 slash commands, 16 skills, 1,325 BATS tests, zero cloud dependencies.</w:t>
-      </w:r>
-    </w:p>
-    <w:p>
-      <w:pPr>
-        <w:pStyle w:val="ListParagraph"/>
-        <w:numPr>
-          <w:ilvl w:val="0"/>
-          <w:numId w:val="2"/>
-        </w:numPr>
-        <w:spacing w:after="40"/>
-      </w:pPr>
-      <w:r>
-        <w:rPr>
-          <w:b/>
-          <w:bCs/>
-        </w:rPr>
-        <w:t xml:space="preserve">CAST ecosystem (16 Homebrew packages) — </w:t>
+        <w:t xml:space="preserve">CAST (Claude Agent Specialist Team) v7.4.1 — </w:t>
+      </w:r>
+      <w:r>
+        <w:t xml:space="preserve">Designed and maintain a local-first, open-source multi-agent framework for Claude Code: 23 specialist agents, hook-driven dispatch, model-aware routing (Sonnet for complex work, Haiku for lightweight/review), per-agent persistent memory with FTS5 search, and local SQLite observability. 19 slash commands, 16 skills, 1,185 BATS tests, zero cloud dependencies.</w:t>
+      </w:r>
+    </w:p>
+    <w:p>
+      <w:pPr>
+        <w:pStyle w:val="ListParagraph"/>
+        <w:numPr>
+          <w:ilvl w:val="0"/>
+          <w:numId w:val="2"/>
+        </w:numPr>
+        <w:spacing w:after="40"/>
+      </w:pPr>
+      <w:r>
+        <w:rPr>
+          <w:b/>
+          <w:bCs/>
+        </w:rPr>
+        <w:t xml:space="preserve">CAST ecosystem (13 Homebrew taps plus the umbrella cast formula) — </w:t>
       </w:r>
       <w:r>
         <w:t xml:space="preserve">Architected a modular distribution strategy — cast-agents, cast-hooks, cast-observe, cast-security, cast-dash, cast-memory, cast-parallel, cast-routines, cast-doctor, Claude’s Journal, and more — each with its own tap, versioned releases, and standalone functionality.</w:t>

</xml_diff>

<commit_message>
fix: sync CAST stats to canonical 2026-06-12 values (1394 tests)
Flagship repo's canonical stats moved after the June 5 snapshot:
- tests: 1185 → 1394
- commands: 19 → 20
- skills: 16 → 15
- tables: 38 → 35

cast-stats-drift-check on PR #7 correctly blocked the merge. Stats JSON,
generated castStats.js, and resume docx/PDF all refreshed to canonical.
Unblocks drift gate.

Co-Authored-By: Claude <noreply@anthropic.com>
</commit_message>
<xml_diff>
--- a/assets/resume/Edward_Kubiak_Resume.docx
+++ b/assets/resume/Edward_Kubiak_Resume.docx
@@ -194,7 +194,7 @@
         <w:t xml:space="preserve">Testing: </w:t>
       </w:r>
       <w:r>
-        <w:t xml:space="preserve">Vitest, BATS (1,185 shell tests), Playwright, Supertest, React Testing Library</w:t>
+        <w:t xml:space="preserve">Vitest, BATS (1,394 shell tests), Playwright, Supertest, React Testing Library</w:t>
       </w:r>
     </w:p>
     <w:p>
@@ -260,7 +260,7 @@
         <w:t xml:space="preserve">CAST (Claude Agent Specialist Team) v7.4.1 — </w:t>
       </w:r>
       <w:r>
-        <w:t xml:space="preserve">Designed and maintain a local-first, open-source multi-agent framework for Claude Code: 23 specialist agents, hook-driven dispatch, model-aware routing (Sonnet for complex work, Haiku for lightweight/review), per-agent persistent memory with FTS5 search, and local SQLite observability. 19 slash commands, 16 skills, 1,185 BATS tests, zero cloud dependencies.</w:t>
+        <w:t xml:space="preserve">Designed and maintain a local-first, open-source multi-agent framework for Claude Code: 23 specialist agents, hook-driven dispatch, model-aware routing (Sonnet for complex work, Haiku for lightweight/review), per-agent persistent memory with FTS5 search, and local SQLite observability. 20 slash commands, 15 skills, 1,394 BATS tests, zero cloud dependencies.</w:t>
       </w:r>
     </w:p>
     <w:p>

</xml_diff>